<commit_message>
Update FL-02 checklist status
</commit_message>
<xml_diff>
--- a/work/fluency/FL-02/FL-02_Frame_It_as_Cases_Maison_Wendrel.docx
+++ b/work/fluency/FL-02/FL-02_Frame_It_as_Cases_Maison_Wendrel.docx
@@ -449,7 +449,7 @@
         <w:pStyle w:val="ListBullet"/>
       </w:pPr>
       <w:r>
-        <w:t>Revisão final — pendente</w:t>
+        <w:t>Revisão final — concluído</w:t>
       </w:r>
     </w:p>
     <w:p>
@@ -457,7 +457,7 @@
         <w:pStyle w:val="ListBullet"/>
       </w:pPr>
       <w:r>
-        <w:t>Link público — pendente</w:t>
+        <w:t>Link público — concluído</w:t>
       </w:r>
     </w:p>
     <w:p>
@@ -465,7 +465,7 @@
         <w:pStyle w:val="ListBullet"/>
       </w:pPr>
       <w:r>
-        <w:t>Submission no FlyRank — pendente</w:t>
+        <w:t>Submission no FlyRank — concluído</w:t>
       </w:r>
     </w:p>
     <w:sectPr>

</xml_diff>